<commit_message>
Add script to update skripsi.docx with comprehensive UML documentation
</commit_message>
<xml_diff>
--- a/skripsi.docx
+++ b/skripsi.docx
@@ -52540,6 +52540,698 @@
         </w:rPr>
       </w:pPr>
     </w:p>
+    <w:p>
+      <w:pPr>
+        <w:pStyle w:val="Heading1"/>
+      </w:pPr>
+      <w:r>
+        <w:t>Dokumentasi UML — SI Pengelolaan Data Agenda</w:t>
+      </w:r>
+    </w:p>
+    <w:p>
+      <w:r>
+        <w:t>Dokumen ini berisi diagram UML (Use Case, Sequence, Activity, dan Class) untuk sistem SI Pengelolaan Data Agenda, aplikasi berbasis Laravel 12 + Vue 3 (PWA) untuk mengelola surat, disposisi, kegiatan, kehadiran, dan pengingat.</w:t>
+      </w:r>
+    </w:p>
+    <w:p>
+      <w:pPr>
+        <w:pStyle w:val="Heading1"/>
+      </w:pPr>
+      <w:r>
+        <w:t>Ringkasan Sistem</w:t>
+      </w:r>
+    </w:p>
+    <w:p>
+      <w:pPr>
+        <w:pStyle w:val="ListParagraph"/>
+        <w:ind w:left="360"/>
+      </w:pPr>
+      <w:r>
+        <w:t>Login menggunakan email + password (session-based).</w:t>
+      </w:r>
+    </w:p>
+    <w:p>
+      <w:pPr>
+        <w:pStyle w:val="ListParagraph"/>
+        <w:ind w:left="360"/>
+      </w:pPr>
+      <w:r>
+        <w:t>Role: Admin, Staff, Asisten Daerah, OPD.</w:t>
+      </w:r>
+    </w:p>
+    <w:p>
+      <w:pPr>
+        <w:pStyle w:val="ListParagraph"/>
+        <w:ind w:left="360"/>
+      </w:pPr>
+      <w:r>
+        <w:t>Saat Staff membuat Surat, sistem otomatis:</w:t>
+        <w:br/>
+        <w:t xml:space="preserve">   1. Membuat Disposisi dengan keterangan diterima (tanpa perlu diedit), dan</w:t>
+        <w:br/>
+        <w:t xml:space="preserve">   2. Membuat Pengingat untuk seluruh akun Asisten Daerah.</w:t>
+      </w:r>
+    </w:p>
+    <w:p>
+      <w:pPr>
+        <w:pStyle w:val="ListParagraph"/>
+        <w:ind w:left="360"/>
+      </w:pPr>
+      <w:r>
+        <w:t>Saat salah satu role menambah Kegiatan, sistem otomatis membuat Pengingat untuk semua role.</w:t>
+      </w:r>
+    </w:p>
+    <w:p>
+      <w:pPr>
+        <w:pStyle w:val="ListParagraph"/>
+        <w:ind w:left="360"/>
+      </w:pPr>
+      <w:r>
+        <w:t>Saat menambah Kegiatan, sistem otomatis melakukan Cek Bentrok Jadwal: jika sudah ada kegiatan lain pada tanggal dan jam yang sama, pembuatan kegiatan ditolak.</w:t>
+      </w:r>
+    </w:p>
+    <w:p>
+      <w:pPr>
+        <w:pStyle w:val="ListParagraph"/>
+        <w:ind w:left="360"/>
+      </w:pPr>
+      <w:r>
+        <w:t>Hanya OPD yang dapat melakukan Konfirmasi Kehadiran kegiatan (hadir / tidak), tercatat per akun OPD. Role lain dapat melihat rekap dan daftar OPD yang mengonfirmasi.</w:t>
+      </w:r>
+    </w:p>
+    <w:p>
+      <w:pPr>
+        <w:pStyle w:val="ListParagraph"/>
+        <w:ind w:left="360"/>
+      </w:pPr>
+      <w:r>
+        <w:t>Disposisi dapat Diserahkan atau Ditolak (wajib alasan) oleh Asisten Daerah.</w:t>
+      </w:r>
+    </w:p>
+    <w:p>
+      <w:pPr>
+        <w:pStyle w:val="Heading1"/>
+      </w:pPr>
+      <w:r>
+        <w:t>Aktor</w:t>
+      </w:r>
+    </w:p>
+    <w:tbl>
+      <w:tblPr>
+        <w:tblW w:type="auto" w:w="0"/>
+        <w:tblLook w:firstColumn="1" w:firstRow="1" w:lastColumn="0" w:lastRow="0" w:noHBand="0" w:noVBand="1" w:val="04A0"/>
+      </w:tblPr>
+      <w:tblGrid>
+        <w:gridCol w:w="4515"/>
+        <w:gridCol w:w="4515"/>
+      </w:tblGrid>
+      <w:tr>
+        <w:tc>
+          <w:tcPr>
+            <w:tcW w:type="dxa" w:w="4515"/>
+          </w:tcPr>
+          <w:p>
+            <w:r>
+              <w:t>Aktor</w:t>
+            </w:r>
+          </w:p>
+        </w:tc>
+        <w:tc>
+          <w:tcPr>
+            <w:tcW w:type="dxa" w:w="4515"/>
+          </w:tcPr>
+          <w:p>
+            <w:r>
+              <w:t>Deskripsi</w:t>
+            </w:r>
+          </w:p>
+        </w:tc>
+      </w:tr>
+      <w:tr>
+        <w:tc>
+          <w:tcPr>
+            <w:tcW w:type="dxa" w:w="4515"/>
+          </w:tcPr>
+          <w:p>
+            <w:r>
+              <w:t>Admin</w:t>
+            </w:r>
+          </w:p>
+        </w:tc>
+        <w:tc>
+          <w:tcPr>
+            <w:tcW w:type="dxa" w:w="4515"/>
+          </w:tcPr>
+          <w:p>
+            <w:r>
+              <w:t>Mengelola pengguna &amp; role.</w:t>
+            </w:r>
+          </w:p>
+        </w:tc>
+      </w:tr>
+      <w:tr>
+        <w:tc>
+          <w:tcPr>
+            <w:tcW w:type="dxa" w:w="4515"/>
+          </w:tcPr>
+          <w:p>
+            <w:r>
+              <w:t>Staff</w:t>
+            </w:r>
+          </w:p>
+        </w:tc>
+        <w:tc>
+          <w:tcPr>
+            <w:tcW w:type="dxa" w:w="4515"/>
+          </w:tcPr>
+          <w:p>
+            <w:r>
+              <w:t>Mengelola surat, disposisi, kegiatan, dan pengingat pribadi.</w:t>
+            </w:r>
+          </w:p>
+        </w:tc>
+      </w:tr>
+      <w:tr>
+        <w:tc>
+          <w:tcPr>
+            <w:tcW w:type="dxa" w:w="4515"/>
+          </w:tcPr>
+          <w:p>
+            <w:r>
+              <w:t>Asisten Daerah</w:t>
+            </w:r>
+          </w:p>
+        </w:tc>
+        <w:tc>
+          <w:tcPr>
+            <w:tcW w:type="dxa" w:w="4515"/>
+          </w:tcPr>
+          <w:p>
+            <w:r>
+              <w:t>Meninjau disposisi (menyerahkan/menolak) dan mengelola pengingat pribadi.</w:t>
+            </w:r>
+          </w:p>
+        </w:tc>
+      </w:tr>
+      <w:tr>
+        <w:tc>
+          <w:tcPr>
+            <w:tcW w:type="dxa" w:w="4515"/>
+          </w:tcPr>
+          <w:p>
+            <w:r>
+              <w:t>OPD</w:t>
+            </w:r>
+          </w:p>
+        </w:tc>
+        <w:tc>
+          <w:tcPr>
+            <w:tcW w:type="dxa" w:w="4515"/>
+          </w:tcPr>
+          <w:p>
+            <w:r>
+              <w:t>Mengonfirmasi kehadiran kegiatan dan mengelola pengingat pribadi.</w:t>
+            </w:r>
+          </w:p>
+        </w:tc>
+      </w:tr>
+    </w:tbl>
+    <w:p>
+      <w:pPr>
+        <w:pStyle w:val="Heading1"/>
+      </w:pPr>
+      <w:r>
+        <w:t>1. Use Case Diagram</w:t>
+      </w:r>
+    </w:p>
+    <w:p>
+      <w:r>
+        <w:t>Catatan: &lt;&lt;include&gt;&gt; menandai proses tambahan yang dijalankan otomatis oleh sistem setelah aksi utama.</w:t>
+      </w:r>
+    </w:p>
+    <w:p>
+      <w:r>
+        <w:t>[USE CASE DIAGRAM: Lihat file UML_Documentation.md untuk diagram Mermaid - Admin, Staff, Asisten Daerah, OPD dengan berbagai use case termasuk Login, Lihat Dashboard, Kelola Surat, Disposisi, Kegiatan, Kehadiran, Pengingat, dan Pengguna]</w:t>
+      </w:r>
+    </w:p>
+    <w:p>
+      <w:pPr>
+        <w:pStyle w:val="Heading1"/>
+      </w:pPr>
+      <w:r>
+        <w:t>2. Sequence Diagram</w:t>
+      </w:r>
+    </w:p>
+    <w:p>
+      <w:pPr>
+        <w:pStyle w:val="Heading2"/>
+      </w:pPr>
+      <w:r>
+        <w:t>2.1 Staff Membuat Surat → Auto Disposisi (Diterima) &amp; Pengingat Asisten Daerah</w:t>
+      </w:r>
+    </w:p>
+    <w:p>
+      <w:r>
+        <w:t>[SEQUENCE DIAGRAM: Staff mengisi dan mengirim form Surat → Frontend mengirim POST /api/surat → API menyimpan ke Database → Auto: Buat Disposisi (keterangan = 'diterima') → Auto: Buat Pengingat untuk semua user Asisten Daerah → API mengembalikan 201 Surat tersimpan]</w:t>
+      </w:r>
+    </w:p>
+    <w:p>
+      <w:pPr>
+        <w:pStyle w:val="Heading2"/>
+      </w:pPr>
+      <w:r>
+        <w:t>2.2 Asisten Daerah Meninjau Disposisi (Serahkan / Tolak)</w:t>
+      </w:r>
+    </w:p>
+    <w:p>
+      <w:r>
+        <w:t>[SEQUENCE DIAGRAM: Asisten Daerah klik tombol 'Menyerahkan' atau 'Menolak' → Frontend kirim PATCH /api/disposisi/{id} dengan keterangan 'diserahkan' atau 'ditolak' + alasan → API validasi dan cek role → API update keterangan + alasan jika ditolak → API kembalikan data disposisi terbaru → UI perbarui status]</w:t>
+      </w:r>
+    </w:p>
+    <w:p>
+      <w:pPr>
+        <w:pStyle w:val="Heading2"/>
+      </w:pPr>
+      <w:r>
+        <w:t>2.3 Staff (atau Role Lain) Menambah Kegiatan → Auto Cek Jadwal &amp; Pengingat</w:t>
+      </w:r>
+    </w:p>
+    <w:p>
+      <w:r>
+        <w:t>[SEQUENCE DIAGRAM: Staff isi dan kirim form Kegiatan → Frontend kirim POST /api/kegiatan → Auto: Cek bentrok jadwal (tanggal dan jam yang sama) → Jika bentrok: kembalikan 422 Jadwal bentrok → Jika tersedia: Simpan Kegiatan + Buat Pengingat untuk SEMUA user → 201 Kegiatan tersimpan]</w:t>
+      </w:r>
+    </w:p>
+    <w:p>
+      <w:pPr>
+        <w:pStyle w:val="Heading2"/>
+      </w:pPr>
+      <w:r>
+        <w:t>2.4 OPD Konfirmasi Kehadiran Kegiatan</w:t>
+      </w:r>
+    </w:p>
+    <w:p>
+      <w:r>
+        <w:t>[SEQUENCE DIAGRAM: OPD klik tombol 'Hadir' atau 'Tidak Hadir' → Frontend kirim POST /api/kegiatan/{id}/kehadiran dengan status → API validasi dan cek role OPD → API simpan/ubah kehadiran per OPD → Konfirmasi tersimpan → Status kehadiran diperbarui. Staff/Asisten dapat melihat rekap &amp; daftar OPD]</w:t>
+      </w:r>
+    </w:p>
+    <w:p>
+      <w:pPr>
+        <w:pStyle w:val="Heading1"/>
+      </w:pPr>
+      <w:r>
+        <w:t>3. Activity Diagram</w:t>
+      </w:r>
+    </w:p>
+    <w:p>
+      <w:pPr>
+        <w:pStyle w:val="Heading2"/>
+      </w:pPr>
+      <w:r>
+        <w:t>3.1 Alur Pengelolaan Surat → Disposisi</w:t>
+      </w:r>
+    </w:p>
+    <w:p>
+      <w:r>
+        <w:t>[ACTIVITY DIAGRAM: Mulai → Staff menginput data Surat → Sistem menyimpan Surat → Auto: Membuat Disposisi status Diterima → Auto: Membuat Pengingat ke Asisten Daerah → Asisten Daerah meninjau Disposisi → (Ya) Status Diserahkan / (Tidak) Asisten mengisi Alasan → Status Ditolak + Alasan / Status Diserahkan → Selesai]</w:t>
+      </w:r>
+    </w:p>
+    <w:p>
+      <w:pPr>
+        <w:pStyle w:val="Heading2"/>
+      </w:pPr>
+      <w:r>
+        <w:t>3.2 Alur Konfirmasi Kehadiran Kegiatan (OPD)</w:t>
+      </w:r>
+    </w:p>
+    <w:p>
+      <w:r>
+        <w:t>[ACTIVITY DIAGRAM: Mulai → OPD membuka halaman Kegiatan → (Hadir / Tidak Hadir) → Kirim konfirmasi → Sistem menyimpan konfirmasi per OPD → Role lain dapat melihat rekap &amp; daftar OPD → Selesai]</w:t>
+      </w:r>
+    </w:p>
+    <w:p>
+      <w:pPr>
+        <w:pStyle w:val="Heading2"/>
+      </w:pPr>
+      <w:r>
+        <w:t>3.3 Alur Menambah Kegiatan dengan Auto Cek Bentrok Jadwal</w:t>
+      </w:r>
+    </w:p>
+    <w:p>
+      <w:r>
+        <w:t>[ACTIVITY DIAGRAM: Mulai → Staff menginput data Kegiatan → Auto cek bentrok jadwal → (Bentrok pada tanggal dan jam yang sama) Tolak pembuatan → Pesan: Jadwal bentrok / (Tersedia) Simpan data Kegiatan + Auto Pengingat ke semua role → Selesai]</w:t>
+      </w:r>
+    </w:p>
+    <w:p>
+      <w:pPr>
+        <w:pStyle w:val="Heading1"/>
+      </w:pPr>
+      <w:r>
+        <w:t>4. Class Diagram</w:t>
+      </w:r>
+    </w:p>
+    <w:p>
+      <w:r>
+        <w:t>[CLASS DIAGRAM: Lihat file UML_Documentation.md untuk diagram Mermaid - Role, User, Surat, Disposisi, Kegiatan, KegiatanKehadiran, Pengingat dengan atribut dan relasi]</w:t>
+      </w:r>
+    </w:p>
+    <w:p>
+      <w:pPr>
+        <w:pStyle w:val="Heading2"/>
+      </w:pPr>
+      <w:r>
+        <w:t>Class Descriptions</w:t>
+      </w:r>
+    </w:p>
+    <w:p>
+      <w:pPr>
+        <w:pStyle w:val="ListParagraph"/>
+        <w:ind w:left="360"/>
+      </w:pPr>
+      <w:r>
+        <w:rPr>
+          <w:b/>
+        </w:rPr>
+        <w:t xml:space="preserve">Role: </w:t>
+      </w:r>
+      <w:r>
+        <w:t>id (int), name (string), slug (string)</w:t>
+      </w:r>
+    </w:p>
+    <w:p>
+      <w:pPr>
+        <w:pStyle w:val="ListParagraph"/>
+        <w:ind w:left="360"/>
+      </w:pPr>
+      <w:r>
+        <w:rPr>
+          <w:b/>
+        </w:rPr>
+        <w:t xml:space="preserve">User: </w:t>
+      </w:r>
+      <w:r>
+        <w:t>id (int), name (string), email (string), role_id (int), password (string), role_slug() (method)</w:t>
+      </w:r>
+    </w:p>
+    <w:p>
+      <w:pPr>
+        <w:pStyle w:val="ListParagraph"/>
+        <w:ind w:left="360"/>
+      </w:pPr>
+      <w:r>
+        <w:rPr>
+          <w:b/>
+        </w:rPr>
+        <w:t xml:space="preserve">Surat: </w:t>
+      </w:r>
+      <w:r>
+        <w:t>id (int), tanggal (datetime), nomor_surat (string), asal_surat (string), perihal (string), kepada (string), tanggal_pelaksanaan (datetime), tempat_pelaksanaan (string), pembawa_surat (string), tandatangan (string), disposisis() (method)</w:t>
+      </w:r>
+    </w:p>
+    <w:p>
+      <w:pPr>
+        <w:pStyle w:val="ListParagraph"/>
+        <w:ind w:left="360"/>
+      </w:pPr>
+      <w:r>
+        <w:rPr>
+          <w:b/>
+        </w:rPr>
+        <w:t xml:space="preserve">Disposisi: </w:t>
+      </w:r>
+      <w:r>
+        <w:t>id (int), surat_id (int), tanggal (datetime), nomor_surat (string), asal_surat (string), perihal (string), kepada (string), pembawa_surat (string), tandatangan_penerima (string), tandatangan_dituju (string), keterangan (string), alasan (string), surat() (method)</w:t>
+      </w:r>
+    </w:p>
+    <w:p>
+      <w:pPr>
+        <w:pStyle w:val="ListParagraph"/>
+        <w:ind w:left="360"/>
+      </w:pPr>
+      <w:r>
+        <w:rPr>
+          <w:b/>
+        </w:rPr>
+        <w:t xml:space="preserve">Kegiatan: </w:t>
+      </w:r>
+      <w:r>
+        <w:t>id (int), nama_kegiatan (string), tempat_kegiatan (string), tanggal_kegiatan (datetime), uraian_kegiatan (string), realisasi_pelaksanaan (string), keterangan (string), status (string), nama_penyusun (string), kehadiran() (method)</w:t>
+      </w:r>
+    </w:p>
+    <w:p>
+      <w:pPr>
+        <w:pStyle w:val="ListParagraph"/>
+        <w:ind w:left="360"/>
+      </w:pPr>
+      <w:r>
+        <w:rPr>
+          <w:b/>
+        </w:rPr>
+        <w:t xml:space="preserve">KegiatanKehadiran: </w:t>
+      </w:r>
+      <w:r>
+        <w:t>id (int), kegiatan_id (int), user_id (int), status (string), kegiatan() (method), user() (method)</w:t>
+      </w:r>
+    </w:p>
+    <w:p>
+      <w:pPr>
+        <w:pStyle w:val="ListParagraph"/>
+        <w:ind w:left="360"/>
+      </w:pPr>
+      <w:r>
+        <w:rPr>
+          <w:b/>
+        </w:rPr>
+        <w:t xml:space="preserve">Pengingat: </w:t>
+      </w:r>
+      <w:r>
+        <w:t>id (int), user_id (int), judul (string), deskripsi (string), tanggal_pengingat (datetime), prioritas (string), status (string), user() (method)</w:t>
+      </w:r>
+    </w:p>
+    <w:p>
+      <w:pPr>
+        <w:pStyle w:val="Heading2"/>
+      </w:pPr>
+      <w:r>
+        <w:t>Relationships</w:t>
+      </w:r>
+    </w:p>
+    <w:p>
+      <w:pPr>
+        <w:pStyle w:val="ListParagraph"/>
+        <w:ind w:left="360"/>
+      </w:pPr>
+      <w:r>
+        <w:t>Role (1) → (0..*) User : role_id</w:t>
+      </w:r>
+    </w:p>
+    <w:p>
+      <w:pPr>
+        <w:pStyle w:val="ListParagraph"/>
+        <w:ind w:left="360"/>
+      </w:pPr>
+      <w:r>
+        <w:t>User (1) → (0..*) Pengingat : user_id</w:t>
+      </w:r>
+    </w:p>
+    <w:p>
+      <w:pPr>
+        <w:pStyle w:val="ListParagraph"/>
+        <w:ind w:left="360"/>
+      </w:pPr>
+      <w:r>
+        <w:t>Surat (1) → (0..*) Disposisi : surat_id</w:t>
+      </w:r>
+    </w:p>
+    <w:p>
+      <w:pPr>
+        <w:pStyle w:val="ListParagraph"/>
+        <w:ind w:left="360"/>
+      </w:pPr>
+      <w:r>
+        <w:t>Kegiatan (1) → (0..*) KegiatanKehadiran : kegiatan_id</w:t>
+      </w:r>
+    </w:p>
+    <w:p>
+      <w:pPr>
+        <w:pStyle w:val="ListParagraph"/>
+        <w:ind w:left="360"/>
+      </w:pPr>
+      <w:r>
+        <w:t>User (1) → (0..*) KegiatanKehadiran : user_id</w:t>
+      </w:r>
+    </w:p>
+    <w:p>
+      <w:pPr>
+        <w:pStyle w:val="Heading1"/>
+      </w:pPr>
+      <w:r>
+        <w:t>Nilai Enum / Status</w:t>
+      </w:r>
+    </w:p>
+    <w:tbl>
+      <w:tblPr>
+        <w:tblW w:type="auto" w:w="0"/>
+        <w:tblLook w:firstColumn="1" w:firstRow="1" w:lastColumn="0" w:lastRow="0" w:noHBand="0" w:noVBand="1" w:val="04A0"/>
+      </w:tblPr>
+      <w:tblGrid>
+        <w:gridCol w:w="4515"/>
+        <w:gridCol w:w="4515"/>
+      </w:tblGrid>
+      <w:tr>
+        <w:tc>
+          <w:tcPr>
+            <w:tcW w:type="dxa" w:w="4515"/>
+          </w:tcPr>
+          <w:p>
+            <w:r>
+              <w:t>Atribut</w:t>
+            </w:r>
+          </w:p>
+        </w:tc>
+        <w:tc>
+          <w:tcPr>
+            <w:tcW w:type="dxa" w:w="4515"/>
+          </w:tcPr>
+          <w:p>
+            <w:r>
+              <w:t>Nilai</w:t>
+            </w:r>
+          </w:p>
+        </w:tc>
+      </w:tr>
+      <w:tr>
+        <w:tc>
+          <w:tcPr>
+            <w:tcW w:type="dxa" w:w="4515"/>
+          </w:tcPr>
+          <w:p>
+            <w:r>
+              <w:t>Disposisi.keterangan</w:t>
+            </w:r>
+          </w:p>
+        </w:tc>
+        <w:tc>
+          <w:tcPr>
+            <w:tcW w:type="dxa" w:w="4515"/>
+          </w:tcPr>
+          <w:p>
+            <w:r>
+              <w:t>diterima, ditolak, diserahkan</w:t>
+            </w:r>
+          </w:p>
+        </w:tc>
+      </w:tr>
+      <w:tr>
+        <w:tc>
+          <w:tcPr>
+            <w:tcW w:type="dxa" w:w="4515"/>
+          </w:tcPr>
+          <w:p>
+            <w:r>
+              <w:t>Kegiatan.realisasi_pelaksanaan</w:t>
+            </w:r>
+          </w:p>
+        </w:tc>
+        <w:tc>
+          <w:tcPr>
+            <w:tcW w:type="dxa" w:w="4515"/>
+          </w:tcPr>
+          <w:p>
+            <w:r>
+              <w:t>terlaksana, tidak</w:t>
+            </w:r>
+          </w:p>
+        </w:tc>
+      </w:tr>
+      <w:tr>
+        <w:tc>
+          <w:tcPr>
+            <w:tcW w:type="dxa" w:w="4515"/>
+          </w:tcPr>
+          <w:p>
+            <w:r>
+              <w:t>Kegiatan.status</w:t>
+            </w:r>
+          </w:p>
+        </w:tc>
+        <w:tc>
+          <w:tcPr>
+            <w:tcW w:type="dxa" w:w="4515"/>
+          </w:tcPr>
+          <w:p>
+            <w:r>
+              <w:t>pelaksanaan, laporan</w:t>
+            </w:r>
+          </w:p>
+        </w:tc>
+      </w:tr>
+      <w:tr>
+        <w:tc>
+          <w:tcPr>
+            <w:tcW w:type="dxa" w:w="4515"/>
+          </w:tcPr>
+          <w:p>
+            <w:r>
+              <w:t>KegiatanKehadiran.status</w:t>
+            </w:r>
+          </w:p>
+        </w:tc>
+        <w:tc>
+          <w:tcPr>
+            <w:tcW w:type="dxa" w:w="4515"/>
+          </w:tcPr>
+          <w:p>
+            <w:r>
+              <w:t>hadir, tidak</w:t>
+            </w:r>
+          </w:p>
+        </w:tc>
+      </w:tr>
+      <w:tr>
+        <w:tc>
+          <w:tcPr>
+            <w:tcW w:type="dxa" w:w="4515"/>
+          </w:tcPr>
+          <w:p>
+            <w:r>
+              <w:t>Pengingat.prioritas</w:t>
+            </w:r>
+          </w:p>
+        </w:tc>
+        <w:tc>
+          <w:tcPr>
+            <w:tcW w:type="dxa" w:w="4515"/>
+          </w:tcPr>
+          <w:p>
+            <w:r>
+              <w:t>rendah, sedang, tinggi</w:t>
+            </w:r>
+          </w:p>
+        </w:tc>
+      </w:tr>
+      <w:tr>
+        <w:tc>
+          <w:tcPr>
+            <w:tcW w:type="dxa" w:w="4515"/>
+          </w:tcPr>
+          <w:p>
+            <w:r>
+              <w:t>Pengingat.status</w:t>
+            </w:r>
+          </w:p>
+        </w:tc>
+        <w:tc>
+          <w:tcPr>
+            <w:tcW w:type="dxa" w:w="4515"/>
+          </w:tcPr>
+          <w:p>
+            <w:r>
+              <w:t>pending, selesai</w:t>
+            </w:r>
+          </w:p>
+        </w:tc>
+      </w:tr>
+    </w:tbl>
     <w:sectPr>
       <w:pgSz w:w="11910" w:h="16840"/>
       <w:pgMar w:top="1920" w:right="1440" w:bottom="720" w:left="1440" w:header="0" w:footer="538" w:gutter="0"/>

</xml_diff>